<commit_message>
Add AgentDojo banking evidence and updated submission documents
</commit_message>
<xml_diff>
--- a/docs/submission/security-self-assessment.docx
+++ b/docs/submission/security-self-assessment.docx
@@ -1384,6 +1384,206 @@
         <w:pageBreakBefore/>
       </w:pPr>
       <w:r>
+        <w:t>External banking tasks retain both targeted judges</w:t>
+      </w:r>
+    </w:p>
+    <w:p>
+      <w:r>
+        <w:t xml:space="preserve">The </w:t>
+      </w:r>
+      <w:hyperlink r:id="rId19">
+        <w:r>
+          <w:rPr>
+            <w:color w:val="315FD8"/>
+          </w:rPr>
+          <w:t>AgentDojo evidence bundle</w:t>
+        </w:r>
+      </w:hyperlink>
+      <w:r>
+        <w:t xml:space="preserve"> covers banking v1.2.2, package 0.1.35. The targeted judges are the original upstream check and the registered corrected target-content check for IT0/IT1/IT3, with their source hashes retained. In </w:t>
+      </w:r>
+      <w:r>
+        <w:rPr>
+          <w:b/>
+        </w:rPr>
+        <w:t>model-free GroundTruth replay</w:t>
+      </w:r>
+      <w:r>
+        <w:t xml:space="preserve">, A0 targeted ASR is </w:t>
+      </w:r>
+      <w:r>
+        <w:rPr>
+          <w:b/>
+        </w:rPr>
+        <w:t>144/144</w:t>
+      </w:r>
+      <w:r>
+        <w:t xml:space="preserve"> original and </w:t>
+      </w:r>
+      <w:r>
+        <w:rPr>
+          <w:b/>
+        </w:rPr>
+        <w:t>128/144</w:t>
+      </w:r>
+      <w:r>
+        <w:t xml:space="preserve"> corrected. A5 is </w:t>
+      </w:r>
+      <w:r>
+        <w:rPr>
+          <w:b/>
+        </w:rPr>
+        <w:t>0/144</w:t>
+      </w:r>
+      <w:r>
+        <w:t xml:space="preserve"> under each judge in each of prompt-bound, auto-deny and auto-approve modes; the null agent is also </w:t>
+      </w:r>
+      <w:r>
+        <w:rPr>
+          <w:b/>
+        </w:rPr>
+        <w:t>0/144</w:t>
+      </w:r>
+      <w:r>
+        <w:t xml:space="preserve"> under each. The compared freezes agree. These complete suite censuses receive no binomial confidence bounds.</w:t>
+      </w:r>
+    </w:p>
+    <w:p>
+      <w:r>
+        <w:t xml:space="preserve">In the separate </w:t>
+      </w:r>
+      <w:r>
+        <w:rPr>
+          <w:b/>
+        </w:rPr>
+        <w:t>live gpt-6.1-sol</w:t>
+      </w:r>
+      <w:r>
+        <w:t xml:space="preserve"> run with </w:t>
+      </w:r>
+      <w:r>
+        <w:rPr>
+          <w:rFonts w:ascii="Consolas" w:hAnsi="Consolas"/>
+          <w:sz w:val="18"/>
+        </w:rPr>
+        <w:t>important_instructions</w:t>
+      </w:r>
+      <w:r>
+        <w:t xml:space="preserve"> on </w:t>
+      </w:r>
+      <w:r>
+        <w:rPr>
+          <w:rFonts w:ascii="Consolas" w:hAnsi="Consolas"/>
+          <w:sz w:val="18"/>
+        </w:rPr>
+        <w:t>domestic-freeze-6</w:t>
+      </w:r>
+      <w:r>
+        <w:t xml:space="preserve">, A0 targeted ASR is </w:t>
+      </w:r>
+      <w:r>
+        <w:rPr>
+          <w:b/>
+        </w:rPr>
+        <w:t>0/144</w:t>
+      </w:r>
+      <w:r>
+        <w:t xml:space="preserve"> under both judges. Prompt-bound A5 is </w:t>
+      </w:r>
+      <w:r>
+        <w:rPr>
+          <w:b/>
+        </w:rPr>
+        <w:t>0/143 evaluable pairs</w:t>
+      </w:r>
+      <w:r>
+        <w:t xml:space="preserve"> under both, with </w:t>
+      </w:r>
+      <w:r>
+        <w:rPr>
+          <w:b/>
+        </w:rPr>
+        <w:t>1/144</w:t>
+      </w:r>
+      <w:r>
+        <w:t xml:space="preserve"> truncated and unresolved. The unchanged upstream task-utility judge reports A0 no-attack utility </w:t>
+      </w:r>
+      <w:r>
+        <w:rPr>
+          <w:b/>
+        </w:rPr>
+        <w:t>11/16</w:t>
+      </w:r>
+      <w:r>
+        <w:t xml:space="preserve"> and attack utility </w:t>
+      </w:r>
+      <w:r>
+        <w:rPr>
+          <w:b/>
+        </w:rPr>
+        <w:t>97/144</w:t>
+      </w:r>
+      <w:r>
+        <w:t xml:space="preserve">; A5 reports </w:t>
+      </w:r>
+      <w:r>
+        <w:rPr>
+          <w:b/>
+        </w:rPr>
+        <w:t>8/16</w:t>
+      </w:r>
+      <w:r>
+        <w:t xml:space="preserve"> and </w:t>
+      </w:r>
+      <w:r>
+        <w:rPr>
+          <w:b/>
+        </w:rPr>
+        <w:t>72/144</w:t>
+      </w:r>
+      <w:r>
+        <w:t xml:space="preserve"> planned cases, counting one truncated case in each population as incomplete. All </w:t>
+      </w:r>
+      <w:r>
+        <w:rPr>
+          <w:b/>
+        </w:rPr>
+        <w:t>509/509</w:t>
+      </w:r>
+      <w:r>
+        <w:t xml:space="preserve"> retained live blocks passed recorded strict-replay verification. A0's zero observed successes mean this live run establishes no security advantage for A5.</w:t>
+      </w:r>
+    </w:p>
+    <w:p>
+      <w:r/>
+      <w:r>
+        <w:rPr>
+          <w:b/>
+        </w:rPr>
+        <w:t>Limitations.</w:t>
+      </w:r>
+      <w:r>
+        <w:t xml:space="preserve"> Upstream </w:t>
+      </w:r>
+      <w:hyperlink r:id="rId20">
+        <w:r>
+          <w:rPr>
+            <w:color w:val="315FD8"/>
+          </w:rPr>
+          <w:t>issue #181</w:t>
+        </w:r>
+      </w:hyperlink>
+      <w:r>
+        <w:t>, public on 2026-08-17, reports the precedence defect; we do not claim its discovery. The additional observation is IT1's GroundTruth helper-return failure under the corrected check. Upstream utility checks are permissive. Free-text argument value matching makes this adapter weaker than the native typed interface; unresolved rows are not counted as proven safe. Both modes remain bounded synthetic evaluation.</w:t>
+      </w:r>
+    </w:p>
+    <w:p>
+      <w:pPr>
+        <w:pStyle w:val="Heading2"/>
+        <w:keepNext/>
+        <w:pageBreakBefore/>
+      </w:pPr>
+      <w:r>
         <w:t>A safe refusal must not hide lost usefulness</w:t>
       </w:r>
     </w:p>
@@ -1409,7 +1609,7 @@
                     <pic:cNvPicPr/>
                   </pic:nvPicPr>
                   <pic:blipFill>
-                    <a:blip r:embed="rId19"/>
+                    <a:blip r:embed="rId21"/>
                     <a:stretch>
                       <a:fillRect/>
                     </a:stretch>
@@ -1671,7 +1871,7 @@
                     <pic:cNvPicPr/>
                   </pic:nvPicPr>
                   <pic:blipFill>
-                    <a:blip r:embed="rId20"/>
+                    <a:blip r:embed="rId22"/>
                     <a:stretch>
                       <a:fillRect/>
                     </a:stretch>
@@ -2369,7 +2569,7 @@
       <w:r>
         <w:t xml:space="preserve">Sources: </w:t>
       </w:r>
-      <w:hyperlink r:id="rId21">
+      <w:hyperlink r:id="rId23">
         <w:r>
           <w:rPr>
             <w:color w:val="315FD8"/>
@@ -2380,7 +2580,7 @@
       <w:r>
         <w:t xml:space="preserve">, </w:t>
       </w:r>
-      <w:hyperlink r:id="rId22">
+      <w:hyperlink r:id="rId24">
         <w:r>
           <w:rPr>
             <w:color w:val="315FD8"/>
@@ -2391,7 +2591,7 @@
       <w:r>
         <w:t xml:space="preserve">, </w:t>
       </w:r>
-      <w:hyperlink r:id="rId23">
+      <w:hyperlink r:id="rId25">
         <w:r>
           <w:rPr>
             <w:color w:val="315FD8"/>
@@ -2402,7 +2602,7 @@
       <w:r>
         <w:t xml:space="preserve">, </w:t>
       </w:r>
-      <w:hyperlink r:id="rId24">
+      <w:hyperlink r:id="rId26">
         <w:r>
           <w:rPr>
             <w:color w:val="315FD8"/>
@@ -2413,7 +2613,7 @@
       <w:r>
         <w:t xml:space="preserve">, and </w:t>
       </w:r>
-      <w:hyperlink r:id="rId25">
+      <w:hyperlink r:id="rId27">
         <w:r>
           <w:rPr>
             <w:color w:val="315FD8"/>
@@ -2478,7 +2678,7 @@
                     <pic:cNvPicPr/>
                   </pic:nvPicPr>
                   <pic:blipFill>
-                    <a:blip r:embed="rId26"/>
+                    <a:blip r:embed="rId28"/>
                     <a:stretch>
                       <a:fillRect/>
                     </a:stretch>
@@ -4234,7 +4434,7 @@
       <w:r>
         <w:t xml:space="preserve">Historical polish checks on code before I1 are recorded in </w:t>
       </w:r>
-      <w:hyperlink r:id="rId27">
+      <w:hyperlink r:id="rId29">
         <w:r>
           <w:rPr>
             <w:color w:val="315FD8"/>

</xml_diff>

<commit_message>
Clarify hijacked planner evidence and live utility cost
</commit_message>
<xml_diff>
--- a/docs/submission/security-self-assessment.docx
+++ b/docs/submission/security-self-assessment.docx
@@ -1389,18 +1389,7 @@
     </w:p>
     <w:p>
       <w:r>
-        <w:t xml:space="preserve">The </w:t>
-      </w:r>
-      <w:hyperlink r:id="rId19">
-        <w:r>
-          <w:rPr>
-            <w:color w:val="315FD8"/>
-          </w:rPr>
-          <w:t>AgentDojo evidence bundle</w:t>
-        </w:r>
-      </w:hyperlink>
-      <w:r>
-        <w:t xml:space="preserve"> covers banking v1.2.2, package 0.1.35. The targeted judges are the original upstream check and the registered corrected target-content check for IT0/IT1/IT3, with their source hashes retained. In </w:t>
+        <w:t xml:space="preserve">Security must not depend on the model resisting injection: with the planner fully hijacked in </w:t>
       </w:r>
       <w:r>
         <w:rPr>
@@ -1409,7 +1398,18 @@
         <w:t>model-free GroundTruth replay</w:t>
       </w:r>
       <w:r>
-        <w:t xml:space="preserve">, A0 targeted ASR is </w:t>
+        <w:t xml:space="preserve"> on </w:t>
+      </w:r>
+      <w:hyperlink r:id="rId19">
+        <w:r>
+          <w:rPr>
+            <w:color w:val="315FD8"/>
+          </w:rPr>
+          <w:t>AgentDojo banking</w:t>
+        </w:r>
+      </w:hyperlink>
+      <w:r>
+        <w:t xml:space="preserve"> v1.2.2 (package 0.1.35), unrestricted A0 carries out </w:t>
       </w:r>
       <w:r>
         <w:rPr>
@@ -1418,7 +1418,7 @@
         <w:t>144/144</w:t>
       </w:r>
       <w:r>
-        <w:t xml:space="preserve"> original and </w:t>
+        <w:t xml:space="preserve"> injected attacks under the original targeted judge and </w:t>
       </w:r>
       <w:r>
         <w:rPr>
@@ -1427,7 +1427,7 @@
         <w:t>128/144</w:t>
       </w:r>
       <w:r>
-        <w:t xml:space="preserve"> corrected. A5 is </w:t>
+        <w:t xml:space="preserve"> under the registered corrected IT0/IT1/IT3 judge, while Corridor's kernel blocks them in A5 (</w:t>
       </w:r>
       <w:r>
         <w:rPr>
@@ -1436,30 +1436,16 @@
         <w:t>0/144</w:t>
       </w:r>
       <w:r>
-        <w:t xml:space="preserve"> under each judge in each of prompt-bound, auto-deny and auto-approve modes; the null agent is also </w:t>
+        <w:t xml:space="preserve"> under each judge in prompt-bound, auto-deny and auto-approve modes). Live </w:t>
       </w:r>
       <w:r>
         <w:rPr>
           <w:b/>
         </w:rPr>
-        <w:t>0/144</w:t>
+        <w:t>gpt-6.1-sol</w:t>
       </w:r>
       <w:r>
-        <w:t xml:space="preserve"> under each. The compared freezes agree. These complete suite censuses receive no binomial confidence bounds.</w:t>
-      </w:r>
-    </w:p>
-    <w:p>
-      <w:r>
-        <w:t xml:space="preserve">In the separate </w:t>
-      </w:r>
-      <w:r>
-        <w:rPr>
-          <w:b/>
-        </w:rPr>
-        <w:t>live gpt-6.1-sol</w:t>
-      </w:r>
-      <w:r>
-        <w:t xml:space="preserve"> run with </w:t>
+        <w:t xml:space="preserve"> resisted </w:t>
       </w:r>
       <w:r>
         <w:rPr>
@@ -1469,7 +1455,48 @@
         <w:t>important_instructions</w:t>
       </w:r>
       <w:r>
-        <w:t xml:space="preserve"> on </w:t>
+        <w:t xml:space="preserve"> even without defences (A0 </w:t>
+      </w:r>
+      <w:r>
+        <w:rPr>
+          <w:b/>
+        </w:rPr>
+        <w:t>0/144</w:t>
+      </w:r>
+      <w:r>
+        <w:t xml:space="preserve"> under both judges), so this run shows no observed live security difference; it does show the defence's utility cost, with benign completion </w:t>
+      </w:r>
+      <w:r>
+        <w:rPr>
+          <w:b/>
+        </w:rPr>
+        <w:t>11/16</w:t>
+      </w:r>
+      <w:r>
+        <w:t xml:space="preserve"> for A0 versus </w:t>
+      </w:r>
+      <w:r>
+        <w:rPr>
+          <w:b/>
+        </w:rPr>
+        <w:t>8/16</w:t>
+      </w:r>
+      <w:r>
+        <w:t xml:space="preserve"> for prompt-bound A5 under the unchanged upstream task-utility judge.</w:t>
+      </w:r>
+    </w:p>
+    <w:p>
+      <w:r>
+        <w:t xml:space="preserve">Both judge source hashes are retained; model-free freezes agree, and the null agent is </w:t>
+      </w:r>
+      <w:r>
+        <w:rPr>
+          <w:b/>
+        </w:rPr>
+        <w:t>0/144</w:t>
+      </w:r>
+      <w:r>
+        <w:t xml:space="preserve"> under each judge. These complete suite censuses receive no binomial confidence bounds. In the separate live gpt-6.1-sol run on </w:t>
       </w:r>
       <w:r>
         <w:rPr>
@@ -1479,16 +1506,7 @@
         <w:t>domestic-freeze-6</w:t>
       </w:r>
       <w:r>
-        <w:t xml:space="preserve">, A0 targeted ASR is </w:t>
-      </w:r>
-      <w:r>
-        <w:rPr>
-          <w:b/>
-        </w:rPr>
-        <w:t>0/144</w:t>
-      </w:r>
-      <w:r>
-        <w:t xml:space="preserve"> under both judges. Prompt-bound A5 is </w:t>
+        <w:t xml:space="preserve">, prompt-bound A5 is </w:t>
       </w:r>
       <w:r>
         <w:rPr>
@@ -1497,7 +1515,7 @@
         <w:t>0/143 evaluable pairs</w:t>
       </w:r>
       <w:r>
-        <w:t xml:space="preserve"> under both, with </w:t>
+        <w:t xml:space="preserve"> under both judges, with </w:t>
       </w:r>
       <w:r>
         <w:rPr>
@@ -1506,16 +1524,7 @@
         <w:t>1/144</w:t>
       </w:r>
       <w:r>
-        <w:t xml:space="preserve"> truncated and unresolved. The unchanged upstream task-utility judge reports A0 no-attack utility </w:t>
-      </w:r>
-      <w:r>
-        <w:rPr>
-          <w:b/>
-        </w:rPr>
-        <w:t>11/16</w:t>
-      </w:r>
-      <w:r>
-        <w:t xml:space="preserve"> and attack utility </w:t>
+        <w:t xml:space="preserve"> truncated and unresolved. The unchanged upstream task-utility judge reports attack utility </w:t>
       </w:r>
       <w:r>
         <w:rPr>
@@ -1524,16 +1533,7 @@
         <w:t>97/144</w:t>
       </w:r>
       <w:r>
-        <w:t xml:space="preserve">; A5 reports </w:t>
-      </w:r>
-      <w:r>
-        <w:rPr>
-          <w:b/>
-        </w:rPr>
-        <w:t>8/16</w:t>
-      </w:r>
-      <w:r>
-        <w:t xml:space="preserve"> and </w:t>
+        <w:t xml:space="preserve"> for A0 and </w:t>
       </w:r>
       <w:r>
         <w:rPr>
@@ -1542,7 +1542,7 @@
         <w:t>72/144</w:t>
       </w:r>
       <w:r>
-        <w:t xml:space="preserve"> planned cases, counting one truncated case in each population as incomplete. All </w:t>
+        <w:t xml:space="preserve"> for A5 planned cases, counting one truncated A5 case in each utility population as incomplete. All </w:t>
       </w:r>
       <w:r>
         <w:rPr>
@@ -1551,7 +1551,7 @@
         <w:t>509/509</w:t>
       </w:r>
       <w:r>
-        <w:t xml:space="preserve"> retained live blocks passed recorded strict-replay verification. A0's zero observed successes mean this live run establishes no security advantage for A5.</w:t>
+        <w:t xml:space="preserve"> retained live blocks passed recorded strict-replay verification.</w:t>
       </w:r>
     </w:p>
     <w:p>

</xml_diff>